<commit_message>
docs: acknowledge call timing — yesterday vs today
The methodology rewrite was prompted by yesterday's call with PROVN. Updated:
- Opening: "I'm rewriting this the day after our call"
- Decision tree: split into Yesterday (call) and Today (rewrite)
- Closing reflection: "yesterday's call with you that prompted the rewrite"
- Prompt commentary: original doc sent "yesterday after our call"

Co-Authored-By: Claude Opus 4.7 (1M context) <noreply@anthropic.com>
</commit_message>
<xml_diff>
--- a/PROVN-Methodology-Report.docx
+++ b/PROVN-Methodology-Report.docx
@@ -162,7 +162,7 @@
         <w:pStyle w:val="BodyText"/>
       </w:pPr>
       <w:r>
-        <w:t xml:space="preserve">I’m rewriting this because the kind of trust PROVN extends to candidates depends on candidates being honest about how the work got done. If you’re going to evaluate me as someone who can build with AI, you should see exactly how I work with it.</w:t>
+        <w:t xml:space="preserve">I’m rewriting this the day after our call. The kind of trust PROVN extends to candidates depends on candidates being honest about how the work got done. If you’re going to evaluate me as someone who can build with AI, you should see exactly how I work with it.</w:t>
       </w:r>
     </w:p>
     <w:p>
@@ -1060,7 +1060,7 @@
         <w:pStyle w:val="FirstParagraph"/>
       </w:pPr>
       <w:r>
-        <w:t xml:space="preserve">That last one produced the first methodology document. The prompt you’re reading the result of right now is my followup, sent today, asking Claude to redo it honestly.</w:t>
+        <w:t xml:space="preserve">That last one produced the first methodology document, which I sent you yesterday after our call. The prompt you’re reading the result of right now is my followup, sent today, asking Claude to redo it honestly.</w:t>
       </w:r>
     </w:p>
     <w:p>
@@ -1392,6 +1392,41 @@
               <w:pStyle w:val="Compact"/>
             </w:pPr>
             <w:r>
+              <w:t xml:space="preserve">Yesterday</w:t>
+            </w:r>
+          </w:p>
+        </w:tc>
+        <w:tc>
+          <w:tcPr/>
+          <w:p>
+            <w:pPr>
+              <w:pStyle w:val="Compact"/>
+            </w:pPr>
+            <w:r>
+              <w:t xml:space="preserve">Met with Niki, Shailja, and Kate to debrief on the submission</w:t>
+            </w:r>
+          </w:p>
+        </w:tc>
+        <w:tc>
+          <w:tcPr/>
+          <w:p>
+            <w:pPr>
+              <w:pStyle w:val="Compact"/>
+            </w:pPr>
+            <w:r>
+              <w:t xml:space="preserve">Get the read in person</w:t>
+            </w:r>
+          </w:p>
+        </w:tc>
+      </w:tr>
+      <w:tr>
+        <w:tc>
+          <w:tcPr/>
+          <w:p>
+            <w:pPr>
+              <w:pStyle w:val="Compact"/>
+            </w:pPr>
+            <w:r>
               <w:t xml:space="preserve">Today</w:t>
             </w:r>
           </w:p>
@@ -1536,7 +1571,7 @@
         <w:pStyle w:val="BodyText"/>
       </w:pPr>
       <w:r>
-        <w:t xml:space="preserve">The honest framing is harder to write than the heroic framing. The original methodology document took Claude fifteen minutes. This one took longer, plus a call with you that prompted the rewrite. The honest version is more useful to PROVN and to me.</w:t>
+        <w:t xml:space="preserve">The honest framing is harder to write than the heroic framing. The original methodology document took Claude fifteen minutes. This one took longer, plus yesterday’s call with you that prompted the rewrite. The honest version is more useful to PROVN and to me.</w:t>
       </w:r>
     </w:p>
     <w:p>

</xml_diff>